<commit_message>
Assignment of COS and SDM are uploded successfully
</commit_message>
<xml_diff>
--- a/Assignment07.docx
+++ b/Assignment07.docx
@@ -19,7 +19,7 @@
           <w:sz w:val="32"/>
           <w:szCs w:val="32"/>
         </w:rPr>
-        <w:t xml:space="preserve">Assignment </w:t>
+        <w:t>Assignment 0</w:t>
       </w:r>
       <w:r>
         <w:rPr>
@@ -28,7 +28,7 @@
           <w:sz w:val="32"/>
           <w:szCs w:val="32"/>
         </w:rPr>
-        <w:t>07</w:t>
+        <w:t>7</w:t>
       </w:r>
     </w:p>
     <w:p>
@@ -476,7 +476,7 @@
           <w:noProof/>
         </w:rPr>
         <w:drawing>
-          <wp:inline distT="0" distB="0" distL="0" distR="0" wp14:anchorId="1B3525AE" wp14:editId="6E44E3AD">
+          <wp:inline distT="0" distB="0" distL="0" distR="0" wp14:anchorId="1B3525AE" wp14:editId="20FD3AEA">
             <wp:extent cx="3744686" cy="2682551"/>
             <wp:effectExtent l="0" t="0" r="8255" b="3810"/>
             <wp:docPr id="1554648832" name="Picture 51"/>
@@ -1282,7 +1282,7 @@
           <w:noProof/>
         </w:rPr>
         <w:drawing>
-          <wp:inline distT="0" distB="0" distL="0" distR="0" wp14:anchorId="5C8FE920" wp14:editId="1ACD9F9D">
+          <wp:inline distT="0" distB="0" distL="0" distR="0" wp14:anchorId="5C8FE920" wp14:editId="2993AA69">
             <wp:extent cx="3325920" cy="3135086"/>
             <wp:effectExtent l="0" t="0" r="8255" b="8255"/>
             <wp:docPr id="1109095817" name="Picture 64"/>
@@ -2036,6 +2036,7 @@
   <w:style w:type="character" w:default="1" w:styleId="DefaultParagraphFont">
     <w:name w:val="Default Paragraph Font"/>
     <w:uiPriority w:val="1"/>
+    <w:semiHidden/>
     <w:unhideWhenUsed/>
   </w:style>
   <w:style w:type="table" w:default="1" w:styleId="TableNormal">

</xml_diff>